<commit_message>
Extended paper (new files), assistant accuracy test, departments in synopsis
- paper/build_paper_extended.py builds ChannelTrace_Paper_Extended (9 pages, 46 references):
  fuller related work with a comparison table, native Word equations for all seven models and the
  simulation, system architecture figure, GA360 channel conversion rates and hand-off shares, Criteo
  credit by clicks, weekend effect, threats to validity, ethics. The original draft paper is untouched.
- scripts/eval_assistant.py: 34-question RQ5 test of both assistant paths, resumable across the Gemini
  free-tier quota; the paper adds its results once data/processed/assistant_eval.json exists.
- Synopsis: Information Technology for the team, guide's department filled in.
- Fact sheet no longer says the channel results are in progress.

Co-Authored-By: Claude Opus 5.5 <noreply@anthropic.com>
</commit_message>
<xml_diff>
--- a/synopsis_doc/ChannelTrace_Synopsis.docx
+++ b/synopsis_doc/ChannelTrace_Synopsis.docx
@@ -188,7 +188,7 @@
                 <w:sz w:val="22"/>
                 <w:u w:val="none"/>
               </w:rPr>
-              <w:t>Department: [Department]</w:t>
+              <w:t>Department: Information Technology</w:t>
             </w:r>
           </w:p>
         </w:tc>
@@ -781,6 +781,7 @@
                 <w:sz w:val="20"/>
                 <w:u w:val="none"/>
               </w:rPr>
+              <w:t>Information Technology</w:t>
             </w:r>
           </w:p>
         </w:tc>
@@ -894,6 +895,7 @@
                 <w:sz w:val="20"/>
                 <w:u w:val="none"/>
               </w:rPr>
+              <w:t>Information Technology</w:t>
             </w:r>
           </w:p>
         </w:tc>
@@ -1007,6 +1009,7 @@
                 <w:sz w:val="20"/>
                 <w:u w:val="none"/>
               </w:rPr>
+              <w:t>Information Technology</w:t>
             </w:r>
           </w:p>
         </w:tc>
@@ -1120,6 +1123,7 @@
                 <w:sz w:val="20"/>
                 <w:u w:val="none"/>
               </w:rPr>
+              <w:t>Information Technology</w:t>
             </w:r>
           </w:p>
         </w:tc>
@@ -1199,7 +1203,7 @@
           <w:sz w:val="22"/>
           <w:u w:val="none"/>
         </w:rPr>
-        <w:t>Minal Shahakar</w:t>
+        <w:t>Mrs. Minal Shahakar, Dept. of Computer Engineering (Regional Language)</w:t>
       </w:r>
     </w:p>
     <w:p>
@@ -2989,7 +2993,7 @@
           <w:sz w:val="22"/>
           <w:u w:val="none"/>
         </w:rPr>
-        <w:t>Minal Shahakar</w:t>
+        <w:t>Mrs. Minal Shahakar, Dept. of Computer Engineering (Regional Language)</w:t>
       </w:r>
     </w:p>
     <w:p>

</xml_diff>